<commit_message>
ajout de nouveaux modèles
</commit_message>
<xml_diff>
--- a/public/diplome_v3.docx
+++ b/public/diplome_v3.docx
@@ -1082,19 +1082,19 @@
     <w:tbl>
       <w:tblPr>
         <w:tblStyle w:val="Grilledutableau"/>
-        <w:tblW w:w="7366" w:type="dxa"/>
+        <w:tblW w:w="8075" w:type="dxa"/>
         <w:tblLayout w:type="fixed"/>
         <w:tblLook w:val="04A0" w:firstRow="1" w:lastRow="0" w:firstColumn="1" w:lastColumn="0" w:noHBand="0" w:noVBand="1"/>
       </w:tblPr>
       <w:tblGrid>
-        <w:gridCol w:w="1271"/>
-        <w:gridCol w:w="5103"/>
-        <w:gridCol w:w="992"/>
+        <w:gridCol w:w="846"/>
+        <w:gridCol w:w="6095"/>
+        <w:gridCol w:w="1134"/>
       </w:tblGrid>
       <w:tr>
         <w:tc>
           <w:tcPr>
-            <w:tcW w:w="1271" w:type="dxa"/>
+            <w:tcW w:w="846" w:type="dxa"/>
           </w:tcPr>
           <w:p>
             <w:pPr>
@@ -1115,7 +1115,7 @@
         </w:tc>
         <w:tc>
           <w:tcPr>
-            <w:tcW w:w="5103" w:type="dxa"/>
+            <w:tcW w:w="6095" w:type="dxa"/>
           </w:tcPr>
           <w:p>
             <w:pPr>
@@ -1135,7 +1135,7 @@
         </w:tc>
         <w:tc>
           <w:tcPr>
-            <w:tcW w:w="992" w:type="dxa"/>
+            <w:tcW w:w="1134" w:type="dxa"/>
           </w:tcPr>
           <w:p>
             <w:pPr>
@@ -1162,12 +1162,12 @@
         <w:tblLook w:val="04A0" w:firstRow="1" w:lastRow="0" w:firstColumn="1" w:lastColumn="0" w:noHBand="0" w:noVBand="1"/>
       </w:tblPr>
       <w:tblGrid>
-        <w:gridCol w:w="7366"/>
+        <w:gridCol w:w="8075"/>
       </w:tblGrid>
       <w:tr>
         <w:tc>
           <w:tcPr>
-            <w:tcW w:w="7366" w:type="dxa"/>
+            <w:tcW w:w="8075" w:type="dxa"/>
           </w:tcPr>
           <w:p>
             <w:r>
@@ -1180,24 +1180,27 @@
     <w:tbl>
       <w:tblPr>
         <w:tblStyle w:val="Grilledutableau"/>
-        <w:tblW w:w="7366" w:type="dxa"/>
+        <w:tblW w:w="8075" w:type="dxa"/>
         <w:tblLayout w:type="fixed"/>
         <w:tblLook w:val="04A0" w:firstRow="1" w:lastRow="0" w:firstColumn="1" w:lastColumn="0" w:noHBand="0" w:noVBand="1"/>
       </w:tblPr>
       <w:tblGrid>
-        <w:gridCol w:w="1271"/>
-        <w:gridCol w:w="5103"/>
-        <w:gridCol w:w="992"/>
+        <w:gridCol w:w="846"/>
+        <w:gridCol w:w="6095"/>
+        <w:gridCol w:w="1134"/>
       </w:tblGrid>
       <w:tr>
         <w:tc>
           <w:tcPr>
-            <w:tcW w:w="1271" w:type="dxa"/>
+            <w:tcW w:w="846" w:type="dxa"/>
           </w:tcPr>
           <w:p>
             <w:proofErr w:type="gramStart"/>
             <w:r>
-              <w:t xml:space="preserve">{{ </w:t>
+              <w:t>{{</w:t>
+            </w:r>
+            <w:r>
+              <w:t xml:space="preserve"> </w:t>
             </w:r>
             <w:proofErr w:type="spellStart"/>
             <w:r>
@@ -1205,25 +1208,17 @@
             </w:r>
             <w:proofErr w:type="gramEnd"/>
             <w:r>
-              <w:t>.</w:t>
-            </w:r>
-            <w:proofErr w:type="gramStart"/>
-            <w:r>
-              <w:t>YEAR</w:t>
+              <w:t>.YEAR</w:t>
             </w:r>
             <w:proofErr w:type="spellEnd"/>
             <w:r>
-              <w:t xml:space="preserve"> }</w:t>
-            </w:r>
-            <w:proofErr w:type="gramEnd"/>
-            <w:r>
-              <w:t>} </w:t>
+              <w:t xml:space="preserve"> }}</w:t>
             </w:r>
           </w:p>
         </w:tc>
         <w:tc>
           <w:tcPr>
-            <w:tcW w:w="5103" w:type="dxa"/>
+            <w:tcW w:w="6095" w:type="dxa"/>
           </w:tcPr>
           <w:p>
             <w:proofErr w:type="gramStart"/>
@@ -1246,7 +1241,7 @@
         </w:tc>
         <w:tc>
           <w:tcPr>
-            <w:tcW w:w="992" w:type="dxa"/>
+            <w:tcW w:w="1134" w:type="dxa"/>
           </w:tcPr>
           <w:p>
             <w:r>

</xml_diff>

<commit_message>
passage par le cloud google pour le serveur audit de sécurité
</commit_message>
<xml_diff>
--- a/public/diplome_v3.docx
+++ b/public/diplome_v3.docx
@@ -113,7 +113,6 @@
       </w:r>
     </w:p>
     <w:p>
-      <w:proofErr w:type="gramStart"/>
       <w:r>
         <w:rPr>
           <w:b/>
@@ -133,15 +132,7 @@
           <w:b/>
           <w:bCs/>
         </w:rPr>
-        <w:t>STUDENT</w:t>
-      </w:r>
-      <w:proofErr w:type="gramEnd"/>
-      <w:r>
-        <w:rPr>
-          <w:b/>
-          <w:bCs/>
-        </w:rPr>
-        <w:t>_GENDER}</w:t>
+        <w:t>STUDENT_GENDER}</w:t>
       </w:r>
       <w:r>
         <w:rPr>
@@ -153,7 +144,6 @@
       <w:r>
         <w:t> </w:t>
       </w:r>
-      <w:proofErr w:type="gramStart"/>
       <w:r>
         <w:rPr>
           <w:b/>
@@ -180,23 +170,7 @@
           <w:b/>
           <w:bCs/>
         </w:rPr>
-        <w:t>STUDENT</w:t>
-      </w:r>
-      <w:proofErr w:type="gramEnd"/>
-      <w:r>
-        <w:rPr>
-          <w:b/>
-          <w:bCs/>
-        </w:rPr>
-        <w:t>_</w:t>
-      </w:r>
-      <w:proofErr w:type="gramStart"/>
-      <w:r>
-        <w:rPr>
-          <w:b/>
-          <w:bCs/>
-        </w:rPr>
-        <w:t>LNAME</w:t>
+        <w:t>STUDENT_LNAME</w:t>
       </w:r>
       <w:r>
         <w:rPr>
@@ -205,7 +179,6 @@
         </w:rPr>
         <w:t xml:space="preserve"> }</w:t>
       </w:r>
-      <w:proofErr w:type="gramEnd"/>
       <w:r>
         <w:rPr>
           <w:b/>
@@ -216,7 +189,6 @@
       <w:r>
         <w:t> </w:t>
       </w:r>
-      <w:proofErr w:type="gramStart"/>
       <w:r>
         <w:rPr>
           <w:b/>
@@ -236,23 +208,7 @@
           <w:b/>
           <w:bCs/>
         </w:rPr>
-        <w:t>STUDENT</w:t>
-      </w:r>
-      <w:proofErr w:type="gramEnd"/>
-      <w:r>
-        <w:rPr>
-          <w:b/>
-          <w:bCs/>
-        </w:rPr>
-        <w:t>_</w:t>
-      </w:r>
-      <w:proofErr w:type="gramStart"/>
-      <w:r>
-        <w:rPr>
-          <w:b/>
-          <w:bCs/>
-        </w:rPr>
-        <w:t>FNAME</w:t>
+        <w:t>STUDENT_FNAME</w:t>
       </w:r>
       <w:r>
         <w:rPr>
@@ -261,7 +217,6 @@
         </w:rPr>
         <w:t xml:space="preserve"> }</w:t>
       </w:r>
-      <w:proofErr w:type="gramEnd"/>
       <w:r>
         <w:rPr>
           <w:b/>
@@ -276,7 +231,6 @@
         <w:br/>
         <w:t xml:space="preserve">Né le, </w:t>
       </w:r>
-      <w:proofErr w:type="gramStart"/>
       <w:r>
         <w:t>{</w:t>
       </w:r>
@@ -287,39 +241,22 @@
         <w:t xml:space="preserve"> </w:t>
       </w:r>
       <w:r>
-        <w:t>STUDENT</w:t>
-      </w:r>
-      <w:proofErr w:type="gramEnd"/>
-      <w:r>
-        <w:t>_</w:t>
-      </w:r>
-      <w:proofErr w:type="gramStart"/>
-      <w:r>
-        <w:t>BIRTHDATE</w:t>
+        <w:t>STUDENT_BIRTHDATE</w:t>
       </w:r>
       <w:r>
         <w:t xml:space="preserve"> }</w:t>
       </w:r>
-      <w:proofErr w:type="gramEnd"/>
       <w:r>
         <w:t>}</w:t>
       </w:r>
       <w:r>
-        <w:t xml:space="preserve"> à </w:t>
-      </w:r>
-      <w:proofErr w:type="gramStart"/>
-      <w:r>
-        <w:t>{</w:t>
+        <w:t xml:space="preserve"> à {</w:t>
       </w:r>
       <w:r>
         <w:t xml:space="preserve">{ </w:t>
       </w:r>
       <w:r>
-        <w:t>STUDENT</w:t>
-      </w:r>
-      <w:proofErr w:type="gramEnd"/>
-      <w:r>
-        <w:t>_BIRTHTOWN</w:t>
+        <w:t>STUDENT_BIRTHTOWN</w:t>
       </w:r>
       <w:r>
         <w:t xml:space="preserve"> </w:t>
@@ -337,11 +274,9 @@
         </w:rPr>
         <w:br/>
       </w:r>
-      <w:proofErr w:type="spellStart"/>
       <w:r>
         <w:t>à</w:t>
       </w:r>
-      <w:proofErr w:type="spellEnd"/>
       <w:r>
         <w:t xml:space="preserve"> obtenu en </w:t>
       </w:r>
@@ -381,91 +316,15 @@
           <w:sz w:val="36"/>
           <w:szCs w:val="36"/>
         </w:rPr>
-        <w:t xml:space="preserve">DIPLôME DE </w:t>
-      </w:r>
-      <w:proofErr w:type="gramStart"/>
+        <w:t xml:space="preserve">DIPLôME </w:t>
+      </w:r>
       <w:r>
         <w:rPr>
           <w:caps/>
           <w:sz w:val="36"/>
           <w:szCs w:val="36"/>
         </w:rPr>
-        <w:t>{</w:t>
-      </w:r>
-      <w:r>
-        <w:rPr>
-          <w:caps/>
-          <w:sz w:val="36"/>
-          <w:szCs w:val="36"/>
-        </w:rPr>
-        <w:t xml:space="preserve">{ </w:t>
-      </w:r>
-      <w:r>
-        <w:rPr>
-          <w:caps/>
-          <w:sz w:val="36"/>
-          <w:szCs w:val="36"/>
-        </w:rPr>
-        <w:t>CURS</w:t>
-      </w:r>
-      <w:r>
-        <w:rPr>
-          <w:caps/>
-          <w:sz w:val="36"/>
-          <w:szCs w:val="36"/>
-        </w:rPr>
-        <w:t>U</w:t>
-      </w:r>
-      <w:r>
-        <w:rPr>
-          <w:caps/>
-          <w:sz w:val="36"/>
-          <w:szCs w:val="36"/>
-        </w:rPr>
-        <w:t>S</w:t>
-      </w:r>
-      <w:proofErr w:type="gramEnd"/>
-      <w:r>
-        <w:rPr>
-          <w:caps/>
-          <w:sz w:val="36"/>
-          <w:szCs w:val="36"/>
-        </w:rPr>
-        <w:t>_</w:t>
-      </w:r>
-      <w:r>
-        <w:rPr>
-          <w:caps/>
-          <w:sz w:val="36"/>
-          <w:szCs w:val="36"/>
-        </w:rPr>
-        <w:t>TITLE_</w:t>
-      </w:r>
-      <w:proofErr w:type="gramStart"/>
-      <w:r>
-        <w:rPr>
-          <w:caps/>
-          <w:sz w:val="36"/>
-          <w:szCs w:val="36"/>
-        </w:rPr>
-        <w:t>FR</w:t>
-      </w:r>
-      <w:r>
-        <w:rPr>
-          <w:caps/>
-          <w:sz w:val="36"/>
-          <w:szCs w:val="36"/>
-        </w:rPr>
-        <w:t xml:space="preserve"> }</w:t>
-      </w:r>
-      <w:proofErr w:type="gramEnd"/>
-      <w:r>
-        <w:rPr>
-          <w:caps/>
-          <w:sz w:val="36"/>
-          <w:szCs w:val="36"/>
-        </w:rPr>
-        <w:t>}</w:t>
+        <w:t>{{ "d’" ~ CURSUS_TITLE_FR | replace("de A","d’A") }}</w:t>
       </w:r>
     </w:p>
     <w:p>
@@ -553,7 +412,7 @@
         <w:rPr>
           <w:noProof/>
         </w:rPr>
-        <w:t>18 mai 2026</w:t>
+        <w:t>22 mai 2026</w:t>
       </w:r>
       <w:r>
         <w:fldChar w:fldCharType="end"/>
@@ -669,7 +528,6 @@
       </w:r>
     </w:p>
     <w:p>
-      <w:proofErr w:type="gramStart"/>
       <w:r>
         <w:rPr>
           <w:b/>
@@ -696,23 +554,7 @@
           <w:b/>
           <w:bCs/>
         </w:rPr>
-        <w:t>STUDENT</w:t>
-      </w:r>
-      <w:proofErr w:type="gramEnd"/>
-      <w:r>
-        <w:rPr>
-          <w:b/>
-          <w:bCs/>
-        </w:rPr>
-        <w:t>_</w:t>
-      </w:r>
-      <w:proofErr w:type="gramStart"/>
-      <w:r>
-        <w:rPr>
-          <w:b/>
-          <w:bCs/>
-        </w:rPr>
-        <w:t>GENDER</w:t>
+        <w:t>STUDENT_GENDER</w:t>
       </w:r>
       <w:r>
         <w:rPr>
@@ -721,7 +563,6 @@
         </w:rPr>
         <w:t xml:space="preserve"> }</w:t>
       </w:r>
-      <w:proofErr w:type="gramEnd"/>
       <w:r>
         <w:rPr>
           <w:b/>
@@ -732,7 +573,6 @@
       <w:r>
         <w:t> </w:t>
       </w:r>
-      <w:proofErr w:type="gramStart"/>
       <w:r>
         <w:rPr>
           <w:b/>
@@ -752,23 +592,7 @@
           <w:b/>
           <w:bCs/>
         </w:rPr>
-        <w:t>STUDENT</w:t>
-      </w:r>
-      <w:proofErr w:type="gramEnd"/>
-      <w:r>
-        <w:rPr>
-          <w:b/>
-          <w:bCs/>
-        </w:rPr>
-        <w:t>_</w:t>
-      </w:r>
-      <w:proofErr w:type="gramStart"/>
-      <w:r>
-        <w:rPr>
-          <w:b/>
-          <w:bCs/>
-        </w:rPr>
-        <w:t>LNAME</w:t>
+        <w:t>STUDENT_LNAME</w:t>
       </w:r>
       <w:r>
         <w:rPr>
@@ -777,7 +601,6 @@
         </w:rPr>
         <w:t xml:space="preserve"> }</w:t>
       </w:r>
-      <w:proofErr w:type="gramEnd"/>
       <w:r>
         <w:rPr>
           <w:b/>
@@ -788,7 +611,6 @@
       <w:r>
         <w:t> </w:t>
       </w:r>
-      <w:proofErr w:type="gramStart"/>
       <w:r>
         <w:rPr>
           <w:b/>
@@ -808,23 +630,7 @@
           <w:b/>
           <w:bCs/>
         </w:rPr>
-        <w:t>STUDENT</w:t>
-      </w:r>
-      <w:proofErr w:type="gramEnd"/>
-      <w:r>
-        <w:rPr>
-          <w:b/>
-          <w:bCs/>
-        </w:rPr>
-        <w:t>_</w:t>
-      </w:r>
-      <w:proofErr w:type="gramStart"/>
-      <w:r>
-        <w:rPr>
-          <w:b/>
-          <w:bCs/>
-        </w:rPr>
-        <w:t>FNAME</w:t>
+        <w:t>STUDENT_FNAME</w:t>
       </w:r>
       <w:r>
         <w:rPr>
@@ -833,7 +639,6 @@
         </w:rPr>
         <w:t xml:space="preserve"> }</w:t>
       </w:r>
-      <w:proofErr w:type="gramEnd"/>
       <w:r>
         <w:rPr>
           <w:b/>
@@ -848,7 +653,6 @@
         <w:br/>
         <w:t xml:space="preserve">Né le, </w:t>
       </w:r>
-      <w:proofErr w:type="gramStart"/>
       <w:r>
         <w:t>{</w:t>
       </w:r>
@@ -856,27 +660,86 @@
         <w:t xml:space="preserve">{ </w:t>
       </w:r>
       <w:r>
-        <w:t>STUDENT</w:t>
-      </w:r>
-      <w:proofErr w:type="gramEnd"/>
-      <w:r>
-        <w:t>_</w:t>
-      </w:r>
-      <w:proofErr w:type="gramStart"/>
-      <w:r>
-        <w:t>BIRTHDATE</w:t>
+        <w:t>STUDENT_BIRTHDATE</w:t>
       </w:r>
       <w:r>
         <w:t xml:space="preserve"> }</w:t>
       </w:r>
-      <w:proofErr w:type="gramEnd"/>
       <w:r>
         <w:t>}</w:t>
       </w:r>
       <w:r>
-        <w:t xml:space="preserve"> à </w:t>
-      </w:r>
-      <w:proofErr w:type="gramStart"/>
+        <w:t xml:space="preserve"> à {</w:t>
+      </w:r>
+      <w:r>
+        <w:t xml:space="preserve">{ </w:t>
+      </w:r>
+      <w:r>
+        <w:t>STUDENT_BIRTHTOWN</w:t>
+      </w:r>
+      <w:r>
+        <w:t xml:space="preserve"> }</w:t>
+      </w:r>
+      <w:r>
+        <w:t>} ({</w:t>
+      </w:r>
+      <w:r>
+        <w:t xml:space="preserve">{ </w:t>
+      </w:r>
+      <w:r>
+        <w:t>STUDENT_BIRTHDEPARTMENT</w:t>
+      </w:r>
+      <w:r>
+        <w:t xml:space="preserve"> </w:t>
+      </w:r>
+      <w:r>
+        <w:t>}</w:t>
+      </w:r>
+      <w:r>
+        <w:t>}</w:t>
+      </w:r>
+      <w:r>
+        <w:t>)</w:t>
+      </w:r>
+      <w:r>
+        <w:br/>
+      </w:r>
+      <w:r>
+        <w:t>à</w:t>
+      </w:r>
+      <w:r>
+        <w:t xml:space="preserve"> obtenu en </w:t>
+      </w:r>
+      <w:r>
+        <w:fldChar w:fldCharType="begin"/>
+      </w:r>
+      <w:r>
+        <w:instrText xml:space="preserve"> TIME \@ "MMMM yy" </w:instrText>
+      </w:r>
+      <w:r>
+        <w:fldChar w:fldCharType="separate"/>
+      </w:r>
+      <w:r>
+        <w:rPr>
+          <w:noProof/>
+        </w:rPr>
+        <w:t>mai 26</w:t>
+      </w:r>
+      <w:r>
+        <w:fldChar w:fldCharType="end"/>
+      </w:r>
+      <w:r>
+        <w:t xml:space="preserve"> </w:t>
+      </w:r>
+      <w:r>
+        <w:t xml:space="preserve">à </w:t>
+      </w:r>
+      <w:r>
+        <w:t xml:space="preserve">l’issue du </w:t>
+      </w:r>
+      <w:r>
+        <w:t xml:space="preserve">cursus </w:t>
+      </w:r>
       <w:r>
         <w:t>{</w:t>
       </w:r>
@@ -884,112 +747,56 @@
         <w:t xml:space="preserve">{ </w:t>
       </w:r>
       <w:r>
-        <w:t>STUDENT</w:t>
-      </w:r>
-      <w:proofErr w:type="gramEnd"/>
-      <w:r>
-        <w:t>_</w:t>
-      </w:r>
-      <w:proofErr w:type="gramStart"/>
-      <w:r>
-        <w:t>BIRTHTOWN</w:t>
-      </w:r>
-      <w:r>
-        <w:t xml:space="preserve"> }</w:t>
-      </w:r>
-      <w:proofErr w:type="gramEnd"/>
-      <w:r>
-        <w:t>} (</w:t>
-      </w:r>
-      <w:proofErr w:type="gramStart"/>
-      <w:r>
-        <w:t>{</w:t>
-      </w:r>
-      <w:r>
-        <w:t xml:space="preserve">{ </w:t>
-      </w:r>
-      <w:r>
-        <w:t>STUDENT</w:t>
-      </w:r>
-      <w:proofErr w:type="gramEnd"/>
-      <w:r>
-        <w:t>_BIRTHDEPARTMENT</w:t>
-      </w:r>
-      <w:r>
-        <w:t xml:space="preserve"> </w:t>
+        <w:t>"</w:t>
+      </w:r>
+      <w:r>
+        <w:t>d’</w:t>
+      </w:r>
+      <w:r>
+        <w:t>"</w:t>
+      </w:r>
+      <w:r>
+        <w:t xml:space="preserve"> ~ </w:t>
+      </w:r>
+      <w:r>
+        <w:t>CURSUS</w:t>
+      </w:r>
+      <w:r>
+        <w:t>_TITLE_FR</w:t>
+      </w:r>
+      <w:r>
+        <w:t xml:space="preserve"> | replace</w:t>
+      </w:r>
+      <w:r>
+        <w:t>(</w:t>
+      </w:r>
+      <w:r>
+        <w:t>"</w:t>
+      </w:r>
+      <w:r>
+        <w:t>de A</w:t>
+      </w:r>
+      <w:r>
+        <w:t>"</w:t>
+      </w:r>
+      <w:r>
+        <w:t>,</w:t>
+      </w:r>
+      <w:r>
+        <w:t>"</w:t>
+      </w:r>
+      <w:r>
+        <w:t>d’A</w:t>
+      </w:r>
+      <w:r>
+        <w:t>"</w:t>
+      </w:r>
+      <w:r>
+        <w:t xml:space="preserve">) </w:t>
       </w:r>
       <w:r>
         <w:t>}</w:t>
       </w:r>
-      <w:r>
-        <w:t>}</w:t>
-      </w:r>
-      <w:r>
-        <w:t>)</w:t>
-      </w:r>
-      <w:r>
-        <w:br/>
-      </w:r>
-      <w:proofErr w:type="spellStart"/>
-      <w:r>
-        <w:t>à</w:t>
-      </w:r>
-      <w:proofErr w:type="spellEnd"/>
-      <w:r>
-        <w:t xml:space="preserve"> obtenu en </w:t>
-      </w:r>
-      <w:r>
-        <w:fldChar w:fldCharType="begin"/>
-      </w:r>
-      <w:r>
-        <w:instrText xml:space="preserve"> TIME \@ "MMMM yy" </w:instrText>
-      </w:r>
-      <w:r>
-        <w:fldChar w:fldCharType="separate"/>
-      </w:r>
-      <w:r>
-        <w:rPr>
-          <w:noProof/>
-        </w:rPr>
-        <w:t>mai 26</w:t>
-      </w:r>
-      <w:r>
-        <w:fldChar w:fldCharType="end"/>
-      </w:r>
-      <w:r>
-        <w:t xml:space="preserve"> </w:t>
-      </w:r>
-      <w:r>
-        <w:t xml:space="preserve">à </w:t>
-      </w:r>
-      <w:r>
-        <w:t xml:space="preserve">l’issue du </w:t>
-      </w:r>
-      <w:r>
-        <w:t xml:space="preserve">cursus de </w:t>
-      </w:r>
-      <w:proofErr w:type="gramStart"/>
-      <w:r>
-        <w:t>{</w:t>
-      </w:r>
-      <w:r>
-        <w:t xml:space="preserve">{ </w:t>
-      </w:r>
-      <w:r>
-        <w:t>CURSUS</w:t>
-      </w:r>
-      <w:proofErr w:type="gramEnd"/>
-      <w:r>
-        <w:t>_</w:t>
-      </w:r>
-      <w:proofErr w:type="gramStart"/>
-      <w:r>
-        <w:t>NAME</w:t>
-      </w:r>
-      <w:r>
-        <w:t xml:space="preserve"> }</w:t>
-      </w:r>
-      <w:proofErr w:type="gramEnd"/>
       <w:r>
         <w:t xml:space="preserve">} </w:t>
       </w:r>
@@ -1004,7 +811,6 @@
           <w:lang w:val="en-US"/>
         </w:rPr>
       </w:pPr>
-      <w:proofErr w:type="gramStart"/>
       <w:r>
         <w:rPr>
           <w:b/>
@@ -1033,9 +839,8 @@
           <w:szCs w:val="28"/>
           <w:lang w:val="en-US"/>
         </w:rPr>
-        <w:t>CURSUS</w:t>
-      </w:r>
-      <w:proofErr w:type="gramEnd"/>
+        <w:t>CURSUS_DIPLOMA_AWARDED</w:t>
+      </w:r>
       <w:r>
         <w:rPr>
           <w:b/>
@@ -1044,30 +849,8 @@
           <w:szCs w:val="28"/>
           <w:lang w:val="en-US"/>
         </w:rPr>
-        <w:t>_DIPLOMA_</w:t>
-      </w:r>
-      <w:proofErr w:type="gramStart"/>
-      <w:r>
-        <w:rPr>
-          <w:b/>
-          <w:bCs/>
-          <w:sz w:val="28"/>
-          <w:szCs w:val="28"/>
-          <w:lang w:val="en-US"/>
-        </w:rPr>
-        <w:t>AWARDED</w:t>
-      </w:r>
-      <w:r>
-        <w:rPr>
-          <w:b/>
-          <w:bCs/>
-          <w:sz w:val="28"/>
-          <w:szCs w:val="28"/>
-          <w:lang w:val="en-US"/>
-        </w:rPr>
         <w:t xml:space="preserve"> }</w:t>
       </w:r>
-      <w:proofErr w:type="gramEnd"/>
       <w:r>
         <w:rPr>
           <w:b/>
@@ -1195,24 +978,14 @@
             <w:tcW w:w="846" w:type="dxa"/>
           </w:tcPr>
           <w:p>
-            <w:proofErr w:type="gramStart"/>
             <w:r>
               <w:t>{{</w:t>
             </w:r>
             <w:r>
               <w:t xml:space="preserve"> </w:t>
             </w:r>
-            <w:proofErr w:type="spellStart"/>
             <w:r>
-              <w:t>discipline</w:t>
-            </w:r>
-            <w:proofErr w:type="gramEnd"/>
-            <w:r>
-              <w:t>.YEAR</w:t>
-            </w:r>
-            <w:proofErr w:type="spellEnd"/>
-            <w:r>
-              <w:t xml:space="preserve"> }}</w:t>
+              <w:t>discipline.YEAR }}</w:t>
             </w:r>
           </w:p>
         </w:tc>
@@ -1221,21 +994,8 @@
             <w:tcW w:w="6095" w:type="dxa"/>
           </w:tcPr>
           <w:p>
-            <w:proofErr w:type="gramStart"/>
             <w:r>
-              <w:t xml:space="preserve">{{ </w:t>
-            </w:r>
-            <w:proofErr w:type="spellStart"/>
-            <w:r>
-              <w:t>discipline</w:t>
-            </w:r>
-            <w:proofErr w:type="gramEnd"/>
-            <w:r>
-              <w:t>.TITLE_FR</w:t>
-            </w:r>
-            <w:proofErr w:type="spellEnd"/>
-            <w:r>
-              <w:t xml:space="preserve"> }}</w:t>
+              <w:t>{{ discipline.TITLE_FR }}</w:t>
             </w:r>
           </w:p>
         </w:tc>
@@ -1254,15 +1014,7 @@
     </w:tbl>
     <w:p>
       <w:r>
-        <w:t xml:space="preserve">{% </w:t>
-      </w:r>
-      <w:proofErr w:type="spellStart"/>
-      <w:r>
-        <w:t>endfor</w:t>
-      </w:r>
-      <w:proofErr w:type="spellEnd"/>
-      <w:r>
-        <w:t xml:space="preserve"> %}</w:t>
+        <w:t>{% endfor %}</w:t>
       </w:r>
     </w:p>
     <w:p/>
@@ -1286,7 +1038,7 @@
         <w:rPr>
           <w:noProof/>
         </w:rPr>
-        <w:t>18 mai 2026</w:t>
+        <w:t>22 mai 2026</w:t>
       </w:r>
       <w:r>
         <w:fldChar w:fldCharType="end"/>
@@ -1532,30 +1284,31 @@
         <w:rPr>
           <w:lang w:val="en-US"/>
         </w:rPr>
-        <w:t>Nom de famille/ family name(s</w:t>
-      </w:r>
-      <w:proofErr w:type="gramStart"/>
-      <w:r>
-        <w:rPr>
+        <w:t xml:space="preserve">Nom de famille/ family name(s) : </w:t>
+      </w:r>
+      <w:r>
+        <w:rPr>
+          <w:b/>
+          <w:bCs/>
           <w:lang w:val="en-US"/>
         </w:rPr>
-        <w:t>) :</w:t>
-      </w:r>
-      <w:proofErr w:type="gramEnd"/>
-      <w:r>
-        <w:rPr>
+        <w:t>{</w:t>
+      </w:r>
+      <w:r>
+        <w:rPr>
+          <w:b/>
+          <w:bCs/>
           <w:lang w:val="en-US"/>
         </w:rPr>
-        <w:t xml:space="preserve"> </w:t>
-      </w:r>
-      <w:proofErr w:type="gramStart"/>
+        <w:t xml:space="preserve">{ </w:t>
+      </w:r>
       <w:r>
         <w:rPr>
           <w:b/>
           <w:bCs/>
           <w:lang w:val="en-US"/>
         </w:rPr>
-        <w:t>{</w:t>
+        <w:t>STUDENT_LNAME</w:t>
       </w:r>
       <w:r>
         <w:rPr>
@@ -1563,43 +1316,8 @@
           <w:bCs/>
           <w:lang w:val="en-US"/>
         </w:rPr>
-        <w:t xml:space="preserve">{ </w:t>
-      </w:r>
-      <w:r>
-        <w:rPr>
-          <w:b/>
-          <w:bCs/>
-          <w:lang w:val="en-US"/>
-        </w:rPr>
-        <w:t>STUDENT</w:t>
-      </w:r>
-      <w:proofErr w:type="gramEnd"/>
-      <w:r>
-        <w:rPr>
-          <w:b/>
-          <w:bCs/>
-          <w:lang w:val="en-US"/>
-        </w:rPr>
-        <w:t>_</w:t>
-      </w:r>
-      <w:proofErr w:type="gramStart"/>
-      <w:r>
-        <w:rPr>
-          <w:b/>
-          <w:bCs/>
-          <w:lang w:val="en-US"/>
-        </w:rPr>
-        <w:t>LNAME</w:t>
-      </w:r>
-      <w:r>
-        <w:rPr>
-          <w:b/>
-          <w:bCs/>
-          <w:lang w:val="en-US"/>
-        </w:rPr>
         <w:t xml:space="preserve"> }</w:t>
       </w:r>
-      <w:proofErr w:type="gramEnd"/>
       <w:r>
         <w:rPr>
           <w:b/>
@@ -1618,86 +1336,44 @@
           <w:lang w:val="en-US"/>
         </w:rPr>
       </w:pPr>
-      <w:proofErr w:type="spellStart"/>
       <w:r>
         <w:rPr>
           <w:lang w:val="en-US"/>
         </w:rPr>
-        <w:t>Prénom</w:t>
-      </w:r>
-      <w:proofErr w:type="spellEnd"/>
-      <w:r>
-        <w:rPr>
+        <w:t xml:space="preserve">Prénom(s) / Given name(s) : </w:t>
+      </w:r>
+      <w:r>
+        <w:rPr>
+          <w:b/>
+          <w:bCs/>
           <w:lang w:val="en-US"/>
         </w:rPr>
-        <w:t>(s) / Given name(s</w:t>
-      </w:r>
-      <w:proofErr w:type="gramStart"/>
-      <w:r>
-        <w:rPr>
+        <w:t>{</w:t>
+      </w:r>
+      <w:r>
+        <w:rPr>
+          <w:b/>
+          <w:bCs/>
           <w:lang w:val="en-US"/>
         </w:rPr>
-        <w:t>) :</w:t>
-      </w:r>
-      <w:proofErr w:type="gramEnd"/>
-      <w:r>
-        <w:rPr>
+        <w:t xml:space="preserve">{ </w:t>
+      </w:r>
+      <w:r>
+        <w:rPr>
+          <w:b/>
+          <w:bCs/>
           <w:lang w:val="en-US"/>
         </w:rPr>
-        <w:t xml:space="preserve"> </w:t>
-      </w:r>
-      <w:proofErr w:type="gramStart"/>
+        <w:t>STUDENT_FNAME</w:t>
+      </w:r>
       <w:r>
         <w:rPr>
           <w:b/>
           <w:bCs/>
           <w:lang w:val="en-US"/>
         </w:rPr>
-        <w:t>{</w:t>
-      </w:r>
-      <w:r>
-        <w:rPr>
-          <w:b/>
-          <w:bCs/>
-          <w:lang w:val="en-US"/>
-        </w:rPr>
-        <w:t xml:space="preserve">{ </w:t>
-      </w:r>
-      <w:r>
-        <w:rPr>
-          <w:b/>
-          <w:bCs/>
-          <w:lang w:val="en-US"/>
-        </w:rPr>
-        <w:t>STUDENT</w:t>
-      </w:r>
-      <w:proofErr w:type="gramEnd"/>
-      <w:r>
-        <w:rPr>
-          <w:b/>
-          <w:bCs/>
-          <w:lang w:val="en-US"/>
-        </w:rPr>
-        <w:t>_</w:t>
-      </w:r>
-      <w:proofErr w:type="gramStart"/>
-      <w:r>
-        <w:rPr>
-          <w:b/>
-          <w:bCs/>
-          <w:lang w:val="en-US"/>
-        </w:rPr>
-        <w:t>FNAME</w:t>
-      </w:r>
-      <w:r>
-        <w:rPr>
-          <w:b/>
-          <w:bCs/>
-          <w:lang w:val="en-US"/>
-        </w:rPr>
         <w:t xml:space="preserve"> }</w:t>
       </w:r>
-      <w:proofErr w:type="gramEnd"/>
       <w:r>
         <w:rPr>
           <w:b/>
@@ -1714,17 +1390,8 @@
         <w:jc w:val="center"/>
       </w:pPr>
       <w:r>
-        <w:t xml:space="preserve">Date de naissance /Date of </w:t>
-      </w:r>
-      <w:proofErr w:type="spellStart"/>
-      <w:r>
-        <w:t>birth</w:t>
-      </w:r>
-      <w:proofErr w:type="spellEnd"/>
-      <w:r>
-        <w:t xml:space="preserve"> : </w:t>
-      </w:r>
-      <w:proofErr w:type="gramStart"/>
+        <w:t xml:space="preserve">Date de naissance /Date of birth : </w:t>
+      </w:r>
       <w:r>
         <w:t>{</w:t>
       </w:r>
@@ -1732,20 +1399,11 @@
         <w:t xml:space="preserve">{ </w:t>
       </w:r>
       <w:r>
-        <w:t>STUDENT</w:t>
-      </w:r>
-      <w:proofErr w:type="gramEnd"/>
-      <w:r>
-        <w:t>_</w:t>
-      </w:r>
-      <w:proofErr w:type="gramStart"/>
-      <w:r>
-        <w:t>BIRTHDATE</w:t>
+        <w:t>STUDENT_BIRTHDATE</w:t>
       </w:r>
       <w:r>
         <w:t xml:space="preserve"> }</w:t>
       </w:r>
-      <w:proofErr w:type="gramEnd"/>
       <w:r>
         <w:t>}</w:t>
       </w:r>
@@ -1763,17 +1421,8 @@
         <w:t xml:space="preserve"> </w:t>
       </w:r>
       <w:r>
-        <w:t xml:space="preserve">d’identification de l’étudiant/ Student identification </w:t>
-      </w:r>
-      <w:proofErr w:type="spellStart"/>
-      <w:r>
-        <w:t>number</w:t>
-      </w:r>
-      <w:proofErr w:type="spellEnd"/>
-      <w:r>
-        <w:t xml:space="preserve"> : </w:t>
-      </w:r>
-      <w:proofErr w:type="gramStart"/>
+        <w:t xml:space="preserve">d’identification de l’étudiant/ Student identification number : </w:t>
+      </w:r>
       <w:r>
         <w:t>{</w:t>
       </w:r>
@@ -1784,20 +1433,14 @@
         <w:t xml:space="preserve"> </w:t>
       </w:r>
       <w:r>
-        <w:t>STUDENT</w:t>
-      </w:r>
-      <w:proofErr w:type="gramEnd"/>
-      <w:r>
-        <w:t>_</w:t>
-      </w:r>
-      <w:proofErr w:type="gramStart"/>
+        <w:t>STUDENT_</w:t>
+      </w:r>
       <w:r>
         <w:t>INE</w:t>
       </w:r>
       <w:r>
         <w:t xml:space="preserve"> }</w:t>
       </w:r>
-      <w:proofErr w:type="gramEnd"/>
       <w:r>
         <w:t>}</w:t>
       </w:r>

</xml_diff>